<commit_message>
feat: update experience details and technologies in resumes; enhance descriptions for roles
</commit_message>
<xml_diff>
--- a/pdf/jayson-monterroso-resume.docx
+++ b/pdf/jayson-monterroso-resume.docx
@@ -1407,7 +1407,7 @@
               <w:pStyle w:val="ResumePosition"/>
             </w:pPr>
             <w:r>
-              <w:t>SENIOR SOFTWARE ENGINEER</w:t>
+              <w:t>SENIOR FULLSTACK ENGINEER</w:t>
             </w:r>
           </w:p>
           <w:p>
@@ -1450,7 +1450,7 @@
               <w:pStyle w:val="Positionbullet"/>
             </w:pPr>
             <w:r>
-              <w:t>Replaced MuleSoft APIs (events, orders, points, profiles, rewards, Snowflake, Aptos) with scalable Node.js microservices, reducing third-party licensing expenses and enabling complete in-house API ownership for faster iteration and maintainability.</w:t>
+              <w:t>Replaced MuleSoft APIs with scalable Node.js microservices, reducing licensing costs and bringing loyalty integrations in-house.</w:t>
             </w:r>
             <w:proofErr w:type="spellStart"/>
             <w:r/>
@@ -1464,7 +1464,7 @@
               <w:pStyle w:val="Positionbullet"/>
             </w:pPr>
             <w:r>
-              <w:t>Developed a scalable event-driven architecture using AWS SQS/SNS, consumers, and domain controllers, enhancing the throughput and reliability of loyalty microservices.</w:t>
+              <w:t>Built event-driven AWS SQS/SNS architecture, improving loyalty microservice throughput and reliability.</w:t>
             </w:r>
             <w:r/>
             <w:r/>
@@ -1480,7 +1480,7 @@
               <w:pStyle w:val="Positionbullet"/>
             </w:pPr>
             <w:r>
-              <w:t>Integrated microservices with core enterprise systems including PredictSpring POS, Aptos POS, UA.com, OMS, SFSC, and SFCC.</w:t>
+              <w:t>Integrated PredictSpring and Aptos POS, UA.com, OMS, SFSC, and SFCC across core commerce systems.</w:t>
             </w:r>
             <w:proofErr w:type="spellStart"/>
             <w:r/>
@@ -1500,7 +1500,7 @@
               <w:pStyle w:val="Positionbullet"/>
             </w:pPr>
             <w:r>
-              <w:t>Built and hardened commerce experiences including shoppable social content, checkout, returns, search tracking, and fulfillment notifications with comprehensive automated tests.</w:t>
+              <w:t>Built and hardened shoppable social, checkout, returns, search, and fulfillment features, applying enterprise-approved GitHub Copilot agentic workflows to accelerate delivery, automated testing, and documentation.</w:t>
             </w:r>
           </w:p>
           <w:p>
@@ -1628,6 +1628,7 @@
           <w:p>
             <w:pPr>
               <w:pStyle w:val="Positionbullet"/>
+              <w:spacing w:after="0"/>
             </w:pPr>
             <w:r>
               <w:t xml:space="preserve">Built/maintain </w:t>
@@ -1651,18 +1652,15 @@
           <w:p>
             <w:pPr>
               <w:pStyle w:val="ResumePosition"/>
-              <w:keepNext/>
-              <w:pageBreakBefore/>
-            </w:pPr>
-            <w:r>
-              <w:lastRenderedPageBreak/>
+            </w:pPr>
+            <w:r/>
+            <w:r>
               <w:t>SOFTWARE ENGINEER</w:t>
             </w:r>
           </w:p>
           <w:p>
             <w:pPr>
               <w:pStyle w:val="ResumeCompany"/>
-              <w:keepNext/>
               <w:rPr>
                 <w:color w:val="595959"/>
               </w:rPr>

</xml_diff>